<commit_message>
Tài liệu triển khai: đặt múi giờ VPS trước khi hẹn lịch sao lưu
Phát hiện khi tập dượt triển khai thật trên một VPS Ubuntu: tài liệu hẹn
cron sao lưu lúc "0 2 * * *" nhưng không có bước nào đặt múi giờ. VPS mới
cài luôn chạy UTC, nên lịch đó thực ra chạy 9 giờ sáng giờ Việt Nam —
đúng lúc giáo viên điểm danh và phụ huynh mở app — và mọi dấu thời gian
trong nhật ký lệch 7 tiếng, khó tra khi có sự cố.

- Giai đoạn 3.1: thêm lệnh timedatectl set-timezone Asia/Ho_Chi_Minh kèm
  giải thích hậu quả nếu bỏ qua, và cách kiểm lại bằng lệnh date.
- Mục 4.2: thêm lưu ý ngay tại dòng cron, phòng người đọc nhảy thẳng vào.
- Cập nhật số bài kiểm thử trong tài liệu theo đợt B9: 549→629 và
  106→131 (sáu chỗ, gồm cả các bảng kiểm cuối giai đoạn).
- Sinh lại bản Word bằng npm run tai-lieu:quy-trinh, đã kiểm nội dung
  trong tệp sinh ra: có múi giờ, số bài mới, không còn số cũ.

Co-Authored-By: Claude Opus 5 <noreply@anthropic.com>
Claude-Session: https://claude.ai/code/session_01SWQmibntVCGCCRFH2zAfwR
</commit_message>
<xml_diff>
--- a/docs/QUY-TRINH-TRIEN-KHAI.docx
+++ b/docs/QUY-TRINH-TRIEN-KHAI.docx
@@ -42,7 +42,7 @@
           <w:sz w:val="20"/>
           <w:szCs w:val="20"/>
         </w:rPr>
-        <w:t xml:space="preserve">Sinh tự động từ kho mã — bản mã nguồn 438ac2b, ngày 17/08/2026</w:t>
+        <w:t xml:space="preserve">Sinh tự động từ kho mã — bản mã nguồn 441b671, ngày 20/08/2026</w:t>
       </w:r>
     </w:p>
     <w:p>
@@ -1965,7 +1965,7 @@
           <w:sz w:val="19"/>
           <w:szCs w:val="19"/>
         </w:rPr>
-        <w:t xml:space="preserve">npm test                          # 549 bài, khoảng 3 phút</w:t>
+        <w:t xml:space="preserve">npm test                          # 629 bài, khoảng 3 phút</w:t>
       </w:r>
     </w:p>
     <w:p>
@@ -1995,7 +1995,7 @@
           <w:sz w:val="19"/>
           <w:szCs w:val="19"/>
         </w:rPr>
-        <w:t xml:space="preserve">npm run test:giao-dien            # 106 bài trên trình duyệt thật</w:t>
+        <w:t xml:space="preserve">npm run test:giao-dien            # 131 bài trên trình duyệt thật</w:t>
       </w:r>
     </w:p>
     <w:p>
@@ -2266,7 +2266,7 @@
         <w:t xml:space="preserve">☐   </w:t>
       </w:r>
       <w:r>
-        <w:t xml:space="preserve">npm test 549 bài + test:giao-dien 106 bài đều đạt trên chính máy này</w:t>
+        <w:t xml:space="preserve">npm test 629 bài + test:giao-dien 131 bài đều đạt trên chính máy này</w:t>
       </w:r>
     </w:p>
     <w:p>
@@ -2399,7 +2399,7 @@
           <w:sz w:val="19"/>
           <w:szCs w:val="19"/>
         </w:rPr>
-        <w:t xml:space="preserve">curl -fsSL https://deb.nodesource.com/setup_22.x | bash -</w:t>
+        <w:t xml:space="preserve">timedatectl set-timezone Asia/Ho_Chi_Minh    # đừng bỏ qua dòng này</w:t>
       </w:r>
     </w:p>
     <w:p>
@@ -2414,7 +2414,7 @@
           <w:sz w:val="19"/>
           <w:szCs w:val="19"/>
         </w:rPr>
-        <w:t xml:space="preserve">apt -y install nodejs git</w:t>
+        <w:t xml:space="preserve">curl -fsSL https://deb.nodesource.com/setup_22.x | bash -</w:t>
       </w:r>
     </w:p>
     <w:p>
@@ -2429,7 +2429,68 @@
           <w:sz w:val="19"/>
           <w:szCs w:val="19"/>
         </w:rPr>
+        <w:t xml:space="preserve">apt -y install nodejs git</w:t>
+      </w:r>
+    </w:p>
+    <w:p>
+      <w:pPr>
+        <w:shd w:fill="F1F5F9" w:val="clear"/>
+        <w:spacing w:after="20"/>
+        <w:ind w:left="240"/>
+      </w:pPr>
+      <w:r>
+        <w:rPr>
+          <w:rFonts w:ascii="Consolas" w:cs="Consolas" w:eastAsia="Consolas" w:hAnsi="Consolas"/>
+          <w:sz w:val="19"/>
+          <w:szCs w:val="19"/>
+        </w:rPr>
         <w:t xml:space="preserve">node --version        # phải in ra v22.x</w:t>
+      </w:r>
+    </w:p>
+    <w:p>
+      <w:pPr>
+        <w:spacing w:after="120"/>
+      </w:pPr>
+      <w:r>
+        <w:rPr>
+          <w:b/>
+          <w:bCs/>
+        </w:rPr>
+        <w:t xml:space="preserve">Vì sao phải đặt múi giờ: </w:t>
+      </w:r>
+      <w:r>
+        <w:t xml:space="preserve">VPS mới cài luôn chạy giờ UTC, chậm hơn Việt Nam 7 tiếng. Bỏ qua dòng đó thì lịch sao lưu </w:t>
+      </w:r>
+      <w:r>
+        <w:rPr>
+          <w:b/>
+          <w:bCs/>
+        </w:rPr>
+        <w:t xml:space="preserve">"2 giờ sáng"</w:t>
+      </w:r>
+      <w:r>
+        <w:t xml:space="preserve"> ở mục 4.2 sẽ chạy vào </w:t>
+      </w:r>
+      <w:r>
+        <w:rPr>
+          <w:b/>
+          <w:bCs/>
+        </w:rPr>
+        <w:t xml:space="preserve">9 giờ sáng</w:t>
+      </w:r>
+      <w:r>
+        <w:t xml:space="preserve"> — đúng lúc giáo viên điểm danh và phụ huynh mở app — và mọi dấu thời gian trong nhật ký đều lệch 7 tiếng, rất khó tra khi có sự cố. Kiểm tra lại bằng lệnh </w:t>
+      </w:r>
+      <w:r>
+        <w:rPr>
+          <w:rFonts w:ascii="Consolas" w:cs="Consolas" w:eastAsia="Consolas" w:hAnsi="Consolas"/>
+          <w:sz w:val="19"/>
+          <w:szCs w:val="19"/>
+        </w:rPr>
+        <w:t xml:space="preserve">date</w:t>
+      </w:r>
+      <w:r>
+        <w:t xml:space="preserve">, phải in ra giờ Việt Nam.</w:t>
       </w:r>
     </w:p>
     <w:p>
@@ -2501,7 +2562,7 @@
           <w:sz w:val="19"/>
           <w:szCs w:val="19"/>
         </w:rPr>
-        <w:t xml:space="preserve">npm test              # 549 bài — phải PASS toàn bộ, FAIL: 0</w:t>
+        <w:t xml:space="preserve">npm test              # 629 bài — phải PASS toàn bộ, FAIL: 0</w:t>
       </w:r>
     </w:p>
     <w:p>
@@ -2509,7 +2570,7 @@
         <w:spacing w:after="120"/>
       </w:pPr>
       <w:r>
-        <w:t xml:space="preserve">Bộ giao diện 106 bài cần trình duyệt — không cần chạy trên VPS; chạy trên máy cá nhân của người phụ trách là đủ.</w:t>
+        <w:t xml:space="preserve">Bộ giao diện 131 bài cần trình duyệt — không cần chạy trên VPS; chạy trên máy cá nhân của người phụ trách là đủ.</w:t>
       </w:r>
     </w:p>
     <w:p>
@@ -3074,7 +3135,7 @@
         <w:t xml:space="preserve">☐   </w:t>
       </w:r>
       <w:r>
-        <w:t xml:space="preserve">npm test 549 bài đạt toàn bộ trên VPS</w:t>
+        <w:t xml:space="preserve">npm test 629 bài đạt toàn bộ trên VPS</w:t>
       </w:r>
     </w:p>
     <w:p>
@@ -3336,6 +3397,26 @@
           <w:szCs w:val="19"/>
         </w:rPr>
         <w:t xml:space="preserve">0 2 * * * cd /opt/schoolconnect &amp;&amp; DATA_DIR=/var/lib/schoolconnect npm run backup</w:t>
+      </w:r>
+    </w:p>
+    <w:p>
+      <w:pPr>
+        <w:pBdr>
+          <w:left w:val="single" w:color="9F1239" w:sz="18"/>
+        </w:pBdr>
+        <w:spacing w:after="140"/>
+        <w:ind w:left="240"/>
+      </w:pPr>
+      <w:r>
+        <w:rPr>
+          <w:b/>
+          <w:bCs/>
+          <w:color w:val="9F1239"/>
+        </w:rPr>
+        <w:t xml:space="preserve">Lưu ý:  </w:t>
+      </w:r>
+      <w:r>
+        <w:t xml:space="preserve">dòng trên chỉ đúng nếu VPS đã đặt múi giờ Việt Nam ở mục 3.1. VPS để nguyên giờ UTC thì "2 giờ sáng" hóa ra 9 giờ sáng — đúng giờ giáo viên điểm danh. Kiểm bằng lệnh date trước khi đặt lịch.</w:t>
       </w:r>
     </w:p>
     <w:p>

</xml_diff>